<commit_message>
Doku zusaetzlich als Markdown, Abschnittsnummerierung 15.x korrigiert, Projektname anonymisiert
Co-Authored-By: Claude Sonnet 5.5 <noreply@anthropic.com>
Claude-Session: https://claude.ai/code/session_016jyncTjVMSwWdUWAi6pRDB
</commit_message>
<xml_diff>
--- a/docs/QFieldCloud_Deployment_Dokumentation.docx
+++ b/docs/QFieldCloud_Deployment_Dokumentation.docx
@@ -6909,7 +6909,7 @@
           <w:sz w:val="22"/>
           <w:szCs w:val="22"/>
         </w:rPr>
-        <w:t xml:space="preserve">Unabhängig vom NAS-Backup speichert QFieldCloud selbst mehrere Versionen jeder Projektdatei im Objekt-Storage (rustfs) – zu erkennen am Feld File storage bytes auf der Projektseite, das bei häufig getesteten Projekten (z. B. Gabi_cloud, 720 MB trotz kleiner aktueller Grösse) durch angesammelte alte Versionen deutlich über der tatsächlichen Projektgrösse liegt.</w:t>
+        <w:t xml:space="preserve">Unabhängig vom NAS-Backup speichert QFieldCloud selbst mehrere Versionen jeder Projektdatei im Objekt-Storage (rustfs) – zu erkennen am Feld File storage bytes auf der Projektseite, das bei häufig getesteten Projekten (z. B. Beispielprojekt_cloud, 720 MB trotz kleiner aktueller Grösse) durch angesammelte alte Versionen deutlich über der tatsächlichen Projektgrösse liegt.</w:t>
       </w:r>
     </w:p>
     <w:p>
@@ -7596,7 +7596,7 @@
         <w:spacing w:after="120" w:before="280"/>
       </w:pPr>
       <w:r>
-        <w:t xml:space="preserve">12.1 Zwei Entscheidungsebenen: SNI und Host-Header</w:t>
+        <w:t xml:space="preserve">15.1 Zwei Entscheidungsebenen: SNI und Host-Header</w:t>
       </w:r>
     </w:p>
     <w:p>
@@ -7688,7 +7688,7 @@
         <w:spacing w:after="120" w:before="280"/>
       </w:pPr>
       <w:r>
-        <w:t xml:space="preserve">12.2 Mehrere Server hinter einem einzigen Port 443</w:t>
+        <w:t xml:space="preserve">15.2 Mehrere Server hinter einem einzigen Port 443</w:t>
       </w:r>
     </w:p>
     <w:p>

</xml_diff>